<commit_message>
1.4.6 - Acréscimo de texto de definição do BDI no Modelo 1; Correção de borda não fechando na última linha das tabelas do Word.
</commit_message>
<xml_diff>
--- a/assets/modelos/Modelo 1 - Word.docx
+++ b/assets/modelos/Modelo 1 - Word.docx
@@ -1,6 +1,6 @@
 
 <file path=word/document.xml><?xml version="1.0" encoding="utf-8"?>
-<w:document xmlns:wpc="http://schemas.microsoft.com/office/word/2010/wordprocessingCanvas" xmlns:cx="http://schemas.microsoft.com/office/drawing/2014/chartex" xmlns:cx1="http://schemas.microsoft.com/office/drawing/2015/9/8/chartex" xmlns:cx2="http://schemas.microsoft.com/office/drawing/2015/10/21/chartex" xmlns:cx3="http://schemas.microsoft.com/office/drawing/2016/5/9/chartex" xmlns:cx4="http://schemas.microsoft.com/office/drawing/2016/5/10/chartex" xmlns:cx5="http://schemas.microsoft.com/office/drawing/2016/5/11/chartex" xmlns:cx6="http://schemas.microsoft.com/office/drawing/2016/5/12/chartex" xmlns:cx7="http://schemas.microsoft.com/office/drawing/2016/5/13/chartex" xmlns:cx8="http://schemas.microsoft.com/office/drawing/2016/5/14/chartex" xmlns:mc="http://schemas.openxmlformats.org/markup-compatibility/2006" xmlns:aink="http://schemas.microsoft.com/office/drawing/2016/ink" xmlns:am3d="http://schemas.microsoft.com/office/drawing/2017/model3d" xmlns:o="urn:schemas-microsoft-com:office:office" xmlns:oel="http://schemas.microsoft.com/office/2019/extlst" xmlns:r="http://schemas.openxmlformats.org/officeDocument/2006/relationships" xmlns:m="http://schemas.openxmlformats.org/officeDocument/2006/math" xmlns:v="urn:schemas-microsoft-com:vml" xmlns:wp14="http://schemas.microsoft.com/office/word/2010/wordprocessingDrawing" xmlns:wp="http://schemas.openxmlformats.org/drawingml/2006/wordprocessingDrawing" xmlns:w10="urn:schemas-microsoft-com:office:word" xmlns:w="http://schemas.openxmlformats.org/wordprocessingml/2006/main" xmlns:w14="http://schemas.microsoft.com/office/word/2010/wordml" xmlns:w15="http://schemas.microsoft.com/office/word/2012/wordml" xmlns:w16cex="http://schemas.microsoft.com/office/word/2018/wordml/cex" xmlns:w16cid="http://schemas.microsoft.com/office/word/2016/wordml/cid" xmlns:w16="http://schemas.microsoft.com/office/word/2018/wordml" xmlns:w16du="http://schemas.microsoft.com/office/word/2023/wordml/word16du" xmlns:w16sdtdh="http://schemas.microsoft.com/office/word/2020/wordml/sdtdatahash" xmlns:w16sdtfl="http://schemas.microsoft.com/office/word/2024/wordml/sdtformatlock" xmlns:w16se="http://schemas.microsoft.com/office/word/2015/wordml/symex" xmlns:wpg="http://schemas.microsoft.com/office/word/2010/wordprocessingGroup" xmlns:wpi="http://schemas.microsoft.com/office/word/2010/wordprocessingInk" xmlns:wne="http://schemas.microsoft.com/office/word/2006/wordml" xmlns:wps="http://schemas.microsoft.com/office/word/2010/wordprocessingShape" mc:Ignorable="w14 w15 w16se w16cid w16 w16cex w16sdtdh w16sdtfl w16du wp14">
+<w:document xmlns:wpc="http://schemas.microsoft.com/office/word/2010/wordprocessingCanvas" xmlns:cx="http://schemas.microsoft.com/office/drawing/2014/chartex" xmlns:cx1="http://schemas.microsoft.com/office/drawing/2015/9/8/chartex" xmlns:cx2="http://schemas.microsoft.com/office/drawing/2015/10/21/chartex" xmlns:cx3="http://schemas.microsoft.com/office/drawing/2016/5/9/chartex" xmlns:cx4="http://schemas.microsoft.com/office/drawing/2016/5/10/chartex" xmlns:cx5="http://schemas.microsoft.com/office/drawing/2016/5/11/chartex" xmlns:cx6="http://schemas.microsoft.com/office/drawing/2016/5/12/chartex" xmlns:cx7="http://schemas.microsoft.com/office/drawing/2016/5/13/chartex" xmlns:cx8="http://schemas.microsoft.com/office/drawing/2016/5/14/chartex" xmlns:mc="http://schemas.openxmlformats.org/markup-compatibility/2006" xmlns:aink="http://schemas.microsoft.com/office/drawing/2016/ink" xmlns:am3d="http://schemas.microsoft.com/office/drawing/2017/model3d" xmlns:o="urn:schemas-microsoft-com:office:office" xmlns:oel="http://schemas.microsoft.com/office/2019/extlst" xmlns:r="http://schemas.openxmlformats.org/officeDocument/2006/relationships" xmlns:m="http://schemas.openxmlformats.org/officeDocument/2006/math" xmlns:v="urn:schemas-microsoft-com:vml" xmlns:wp14="http://schemas.microsoft.com/office/word/2010/wordprocessingDrawing" xmlns:wp="http://schemas.openxmlformats.org/drawingml/2006/wordprocessingDrawing" xmlns:w10="urn:schemas-microsoft-com:office:word" xmlns:w="http://schemas.openxmlformats.org/wordprocessingml/2006/main" xmlns:w14="http://schemas.microsoft.com/office/word/2010/wordml" xmlns:w15="http://schemas.microsoft.com/office/word/2012/wordml" xmlns:w16cei="http://schemas.microsoft.com/office/word/2026/wordml/cei" xmlns:w16cex="http://schemas.microsoft.com/office/word/2018/wordml/cex" xmlns:w16cid="http://schemas.microsoft.com/office/word/2016/wordml/cid" xmlns:w16="http://schemas.microsoft.com/office/word/2018/wordml" xmlns:w16du="http://schemas.microsoft.com/office/word/2023/wordml/word16du" xmlns:w16sdtdh="http://schemas.microsoft.com/office/word/2020/wordml/sdtdatahash" xmlns:w16sdtfl="http://schemas.microsoft.com/office/word/2024/wordml/sdtformatlock" xmlns:w16se="http://schemas.microsoft.com/office/word/2015/wordml/symex" xmlns:wpg="http://schemas.microsoft.com/office/word/2010/wordprocessingGroup" xmlns:wpi="http://schemas.microsoft.com/office/word/2010/wordprocessingInk" xmlns:wne="http://schemas.microsoft.com/office/word/2006/wordml" xmlns:wps="http://schemas.microsoft.com/office/word/2010/wordprocessingShape" mc:Ignorable="w14 w15 w16se w16cid w16 w16cex w16sdtdh w16sdtfl w16du wp14">
   <w:body>
     <w:p>
       <w:pPr>
@@ -295,10 +295,28 @@
                 <w:sz w:val="22"/>
                 <w:szCs w:val="22"/>
               </w:rPr>
-              <w:t xml:space="preserve">Código </w:t>
-            </w:r>
-            <w:proofErr w:type="spellStart"/>
-            <w:r>
+              <w:t>Código Sinapi</w:t>
+            </w:r>
+          </w:p>
+        </w:tc>
+        <w:tc>
+          <w:tcPr>
+            <w:tcW w:w="3402" w:type="dxa"/>
+            <w:tcBorders>
+              <w:top w:val="single" w:sz="4" w:space="0" w:color="000000"/>
+              <w:left w:val="nil"/>
+              <w:bottom w:val="single" w:sz="4" w:space="0" w:color="EDEDED"/>
+              <w:right w:val="single" w:sz="4" w:space="0" w:color="EDEDED"/>
+            </w:tcBorders>
+            <w:shd w:val="clear" w:color="C4D79B" w:fill="C4D79B"/>
+            <w:vAlign w:val="center"/>
+            <w:hideMark/>
+          </w:tcPr>
+          <w:p>
+            <w:pPr>
+              <w:spacing w:line="240" w:lineRule="auto"/>
+              <w:ind w:firstLine="0"/>
+              <w:jc w:val="center"/>
               <w:rPr>
                 <w:rFonts w:ascii="Calibri" w:eastAsia="Times New Roman" w:hAnsi="Calibri" w:cs="Calibri"/>
                 <w:b/>
@@ -307,29 +325,8 @@
                 <w:sz w:val="22"/>
                 <w:szCs w:val="22"/>
               </w:rPr>
-              <w:t>Sinapi</w:t>
-            </w:r>
-            <w:proofErr w:type="spellEnd"/>
-          </w:p>
-        </w:tc>
-        <w:tc>
-          <w:tcPr>
-            <w:tcW w:w="3402" w:type="dxa"/>
-            <w:tcBorders>
-              <w:top w:val="single" w:sz="4" w:space="0" w:color="000000"/>
-              <w:left w:val="nil"/>
-              <w:bottom w:val="single" w:sz="4" w:space="0" w:color="EDEDED"/>
-              <w:right w:val="single" w:sz="4" w:space="0" w:color="EDEDED"/>
-            </w:tcBorders>
-            <w:shd w:val="clear" w:color="C4D79B" w:fill="C4D79B"/>
-            <w:vAlign w:val="center"/>
-            <w:hideMark/>
-          </w:tcPr>
-          <w:p>
-            <w:pPr>
-              <w:spacing w:line="240" w:lineRule="auto"/>
-              <w:ind w:firstLine="0"/>
-              <w:jc w:val="center"/>
+            </w:pPr>
+            <w:r>
               <w:rPr>
                 <w:rFonts w:ascii="Calibri" w:eastAsia="Times New Roman" w:hAnsi="Calibri" w:cs="Calibri"/>
                 <w:b/>
@@ -338,8 +335,28 @@
                 <w:sz w:val="22"/>
                 <w:szCs w:val="22"/>
               </w:rPr>
-            </w:pPr>
-            <w:r>
+              <w:t>Descrição</w:t>
+            </w:r>
+          </w:p>
+        </w:tc>
+        <w:tc>
+          <w:tcPr>
+            <w:tcW w:w="567" w:type="dxa"/>
+            <w:tcBorders>
+              <w:top w:val="single" w:sz="4" w:space="0" w:color="000000"/>
+              <w:left w:val="nil"/>
+              <w:bottom w:val="single" w:sz="4" w:space="0" w:color="EDEDED"/>
+              <w:right w:val="single" w:sz="4" w:space="0" w:color="EDEDED"/>
+            </w:tcBorders>
+            <w:shd w:val="clear" w:color="C4D79B" w:fill="C4D79B"/>
+            <w:vAlign w:val="center"/>
+            <w:hideMark/>
+          </w:tcPr>
+          <w:p>
+            <w:pPr>
+              <w:spacing w:line="240" w:lineRule="auto"/>
+              <w:ind w:firstLine="0"/>
+              <w:jc w:val="center"/>
               <w:rPr>
                 <w:rFonts w:ascii="Calibri" w:eastAsia="Times New Roman" w:hAnsi="Calibri" w:cs="Calibri"/>
                 <w:b/>
@@ -348,28 +365,8 @@
                 <w:sz w:val="22"/>
                 <w:szCs w:val="22"/>
               </w:rPr>
-              <w:t>Descrição</w:t>
-            </w:r>
-          </w:p>
-        </w:tc>
-        <w:tc>
-          <w:tcPr>
-            <w:tcW w:w="567" w:type="dxa"/>
-            <w:tcBorders>
-              <w:top w:val="single" w:sz="4" w:space="0" w:color="000000"/>
-              <w:left w:val="nil"/>
-              <w:bottom w:val="single" w:sz="4" w:space="0" w:color="EDEDED"/>
-              <w:right w:val="single" w:sz="4" w:space="0" w:color="EDEDED"/>
-            </w:tcBorders>
-            <w:shd w:val="clear" w:color="C4D79B" w:fill="C4D79B"/>
-            <w:vAlign w:val="center"/>
-            <w:hideMark/>
-          </w:tcPr>
-          <w:p>
-            <w:pPr>
-              <w:spacing w:line="240" w:lineRule="auto"/>
-              <w:ind w:firstLine="0"/>
-              <w:jc w:val="center"/>
+            </w:pPr>
+            <w:r>
               <w:rPr>
                 <w:rFonts w:ascii="Calibri" w:eastAsia="Times New Roman" w:hAnsi="Calibri" w:cs="Calibri"/>
                 <w:b/>
@@ -378,8 +375,28 @@
                 <w:sz w:val="22"/>
                 <w:szCs w:val="22"/>
               </w:rPr>
-            </w:pPr>
-            <w:r>
+              <w:t>Un.</w:t>
+            </w:r>
+          </w:p>
+        </w:tc>
+        <w:tc>
+          <w:tcPr>
+            <w:tcW w:w="709" w:type="dxa"/>
+            <w:tcBorders>
+              <w:top w:val="single" w:sz="4" w:space="0" w:color="000000"/>
+              <w:left w:val="nil"/>
+              <w:bottom w:val="single" w:sz="4" w:space="0" w:color="EDEDED"/>
+              <w:right w:val="single" w:sz="4" w:space="0" w:color="EDEDED"/>
+            </w:tcBorders>
+            <w:shd w:val="clear" w:color="C4D79B" w:fill="C4D79B"/>
+            <w:vAlign w:val="center"/>
+            <w:hideMark/>
+          </w:tcPr>
+          <w:p>
+            <w:pPr>
+              <w:spacing w:line="240" w:lineRule="auto"/>
+              <w:ind w:firstLine="0"/>
+              <w:jc w:val="center"/>
               <w:rPr>
                 <w:rFonts w:ascii="Calibri" w:eastAsia="Times New Roman" w:hAnsi="Calibri" w:cs="Calibri"/>
                 <w:b/>
@@ -388,28 +405,8 @@
                 <w:sz w:val="22"/>
                 <w:szCs w:val="22"/>
               </w:rPr>
-              <w:t>Un.</w:t>
-            </w:r>
-          </w:p>
-        </w:tc>
-        <w:tc>
-          <w:tcPr>
-            <w:tcW w:w="709" w:type="dxa"/>
-            <w:tcBorders>
-              <w:top w:val="single" w:sz="4" w:space="0" w:color="000000"/>
-              <w:left w:val="nil"/>
-              <w:bottom w:val="single" w:sz="4" w:space="0" w:color="EDEDED"/>
-              <w:right w:val="single" w:sz="4" w:space="0" w:color="EDEDED"/>
-            </w:tcBorders>
-            <w:shd w:val="clear" w:color="C4D79B" w:fill="C4D79B"/>
-            <w:vAlign w:val="center"/>
-            <w:hideMark/>
-          </w:tcPr>
-          <w:p>
-            <w:pPr>
-              <w:spacing w:line="240" w:lineRule="auto"/>
-              <w:ind w:firstLine="0"/>
-              <w:jc w:val="center"/>
+            </w:pPr>
+            <w:r>
               <w:rPr>
                 <w:rFonts w:ascii="Calibri" w:eastAsia="Times New Roman" w:hAnsi="Calibri" w:cs="Calibri"/>
                 <w:b/>
@@ -418,30 +415,7 @@
                 <w:sz w:val="22"/>
                 <w:szCs w:val="22"/>
               </w:rPr>
-            </w:pPr>
-            <w:proofErr w:type="spellStart"/>
-            <w:r>
-              <w:rPr>
-                <w:rFonts w:ascii="Calibri" w:eastAsia="Times New Roman" w:hAnsi="Calibri" w:cs="Calibri"/>
-                <w:b/>
-                <w:bCs/>
-                <w:color w:val="000000"/>
-                <w:sz w:val="22"/>
-                <w:szCs w:val="22"/>
-              </w:rPr>
-              <w:t>Qtd</w:t>
-            </w:r>
-            <w:proofErr w:type="spellEnd"/>
-            <w:r>
-              <w:rPr>
-                <w:rFonts w:ascii="Calibri" w:eastAsia="Times New Roman" w:hAnsi="Calibri" w:cs="Calibri"/>
-                <w:b/>
-                <w:bCs/>
-                <w:color w:val="000000"/>
-                <w:sz w:val="22"/>
-                <w:szCs w:val="22"/>
-              </w:rPr>
-              <w:t>.</w:t>
+              <w:t>Qtd.</w:t>
             </w:r>
           </w:p>
         </w:tc>
@@ -27091,15 +27065,782 @@
     </w:p>
     <w:p>
       <w:pPr>
+        <w:pStyle w:val="Ttulo2"/>
+      </w:pPr>
+      <w:bookmarkStart w:id="2" w:name="_Toc216795624"/>
+      <w:r>
+        <w:lastRenderedPageBreak/>
+        <w:t>Definição do BDI</w:t>
+      </w:r>
+      <w:bookmarkEnd w:id="2"/>
+    </w:p>
+    <w:p>
+      <w:pPr>
+        <w:spacing w:line="276" w:lineRule="auto"/>
+      </w:pPr>
+      <w:r>
+        <w:t>Benefícios e Despesas Indiretas (BDI) é uma taxa que se adiciona ao custo de uma obra para cobrir as despesas indiretas que tem o construtor, mais o risco do empreendimento, as despesas financeiras incorridas, os tributos incidentes na operação, o lucro da construtora ou empreiteira e o seu resultado é fruto de uma operação matemática baseados em dados objetivos envolvidos em cada obra.</w:t>
+      </w:r>
+    </w:p>
+    <w:p>
+      <w:pPr>
+        <w:spacing w:line="276" w:lineRule="auto"/>
+      </w:pPr>
+      <w:r>
+        <w:t>De acordo com o relatório do TCU (TC 025.990/2008-2)</w:t>
+      </w:r>
+      <w:r>
+        <w:footnoteReference w:id="1"/>
+      </w:r>
+      <w:r>
+        <w:t xml:space="preserve"> em atendimento ao Acórdão n. 1.425/2007, o BDI—Benefícios e Despesas Indiretas, apesar de tradicional e comumente utilizada na formação de preços da construção civil estava sempre no centro de discussões e controvérsias já que até a edição da Lei de Diretrizes Orçamentárias de 2011, não havia uma norma que definisse os componentes do BDI, o que leva a uma grande diversidade de modelos e composições. Após a Lei n. 12.309, de 09/08/2010 juntamente com a Lei Orçamentária de 2011 (LDO 2011), em seu art. 127 parágrafo 7º, demonstra o seguinte:</w:t>
+      </w:r>
+    </w:p>
+    <w:p>
+      <w:pPr>
+        <w:spacing w:line="276" w:lineRule="auto"/>
+      </w:pPr>
+    </w:p>
+    <w:tbl>
+      <w:tblPr>
+        <w:tblStyle w:val="Tabelacomgrade"/>
+        <w:tblW w:w="0" w:type="auto"/>
+        <w:tblLook w:val="04A0" w:firstRow="1" w:lastRow="0" w:firstColumn="1" w:lastColumn="0" w:noHBand="0" w:noVBand="1"/>
+      </w:tblPr>
+      <w:tblGrid>
+        <w:gridCol w:w="9771"/>
+      </w:tblGrid>
+      <w:tr>
+        <w:trPr>
+          <w:trHeight w:val="2010"/>
+        </w:trPr>
+        <w:tc>
+          <w:tcPr>
+            <w:tcW w:w="9771" w:type="dxa"/>
+          </w:tcPr>
+          <w:p>
+            <w:pPr>
+              <w:spacing w:line="276" w:lineRule="auto"/>
+              <w:rPr>
+                <w:sz w:val="22"/>
+                <w:szCs w:val="22"/>
+              </w:rPr>
+            </w:pPr>
+            <w:r>
+              <w:rPr>
+                <w:sz w:val="22"/>
+                <w:szCs w:val="22"/>
+              </w:rPr>
+              <w:t>‘§ 7o . O preço de referência das obras e serviços de engenharia será aquele resultante da composição do custo unitário direto do sistema utilizado, acrescido do percentual de Benefícios e Despesas Indiretas – BDI, evidenciando em sua composição, no mínimo:</w:t>
+            </w:r>
+          </w:p>
+          <w:p>
+            <w:pPr>
+              <w:spacing w:line="276" w:lineRule="auto"/>
+              <w:rPr>
+                <w:sz w:val="22"/>
+                <w:szCs w:val="22"/>
+              </w:rPr>
+            </w:pPr>
+            <w:r>
+              <w:rPr>
+                <w:sz w:val="22"/>
+                <w:szCs w:val="22"/>
+              </w:rPr>
+              <w:t>I - Taxa de rateio da administração central;</w:t>
+            </w:r>
+          </w:p>
+          <w:p>
+            <w:pPr>
+              <w:spacing w:line="276" w:lineRule="auto"/>
+              <w:rPr>
+                <w:sz w:val="22"/>
+                <w:szCs w:val="22"/>
+              </w:rPr>
+            </w:pPr>
+            <w:r>
+              <w:rPr>
+                <w:sz w:val="22"/>
+                <w:szCs w:val="22"/>
+              </w:rPr>
+              <w:t>II - Percentuais de tributos incidentes sobre o preço do serviço, excluídos aqueles de natureza direta e personalística que oneram o contratado;</w:t>
+            </w:r>
+          </w:p>
+          <w:p>
+            <w:pPr>
+              <w:spacing w:line="276" w:lineRule="auto"/>
+              <w:rPr>
+                <w:sz w:val="22"/>
+                <w:szCs w:val="22"/>
+              </w:rPr>
+            </w:pPr>
+            <w:r>
+              <w:rPr>
+                <w:sz w:val="22"/>
+                <w:szCs w:val="22"/>
+              </w:rPr>
+              <w:t>III - Taxa de risco, seguro e garantia do empreendimento; e</w:t>
+            </w:r>
+          </w:p>
+          <w:p>
+            <w:pPr>
+              <w:spacing w:line="276" w:lineRule="auto"/>
+              <w:rPr>
+                <w:sz w:val="20"/>
+                <w:szCs w:val="20"/>
+              </w:rPr>
+            </w:pPr>
+            <w:r>
+              <w:rPr>
+                <w:sz w:val="22"/>
+                <w:szCs w:val="22"/>
+              </w:rPr>
+              <w:t>IV - Taxa de lucro.’</w:t>
+            </w:r>
+          </w:p>
+        </w:tc>
+      </w:tr>
+    </w:tbl>
+    <w:p>
+      <w:pPr>
+        <w:spacing w:line="276" w:lineRule="auto"/>
+      </w:pPr>
+    </w:p>
+    <w:p>
+      <w:pPr>
+        <w:spacing w:line="276" w:lineRule="auto"/>
+        <w:rPr>
+          <w:b/>
+          <w:bCs/>
+        </w:rPr>
+      </w:pPr>
+      <w:r>
+        <w:rPr>
+          <w:b/>
+          <w:bCs/>
+        </w:rPr>
+        <w:t>Portanto, o valor do BDI adotado para o orçamento deste trabalho está de acordo com os percentuais apresentados pelo TCU- Tribunal de Contas de União em seu relatório TC 025.990/2008-2, em atendimento ao Acórdão n. 1.425/2007.</w:t>
+      </w:r>
+    </w:p>
+    <w:p>
+      <w:pPr>
+        <w:spacing w:line="276" w:lineRule="auto"/>
+        <w:rPr>
+          <w:b/>
+          <w:bCs/>
+        </w:rPr>
+      </w:pPr>
+    </w:p>
+    <w:tbl>
+      <w:tblPr>
+        <w:tblW w:w="9923" w:type="dxa"/>
+        <w:jc w:val="center"/>
+        <w:tblCellMar>
+          <w:left w:w="70" w:type="dxa"/>
+          <w:right w:w="70" w:type="dxa"/>
+        </w:tblCellMar>
+        <w:tblLook w:val="04A0" w:firstRow="1" w:lastRow="0" w:firstColumn="1" w:lastColumn="0" w:noHBand="0" w:noVBand="1"/>
+      </w:tblPr>
+      <w:tblGrid>
+        <w:gridCol w:w="6663"/>
+        <w:gridCol w:w="3260"/>
+      </w:tblGrid>
+      <w:tr>
+        <w:trPr>
+          <w:trHeight w:val="511"/>
+          <w:jc w:val="center"/>
+        </w:trPr>
+        <w:tc>
+          <w:tcPr>
+            <w:tcW w:w="9923" w:type="dxa"/>
+            <w:gridSpan w:val="2"/>
+            <w:tcBorders>
+              <w:top w:val="single" w:sz="8" w:space="0" w:color="auto"/>
+              <w:left w:val="single" w:sz="8" w:space="0" w:color="auto"/>
+              <w:bottom w:val="single" w:sz="8" w:space="0" w:color="auto"/>
+              <w:right w:val="single" w:sz="8" w:space="0" w:color="000000"/>
+            </w:tcBorders>
+            <w:shd w:val="clear" w:color="auto" w:fill="538135" w:themeFill="accent6" w:themeFillShade="BF"/>
+            <w:vAlign w:val="center"/>
+            <w:hideMark/>
+          </w:tcPr>
+          <w:p>
+            <w:pPr>
+              <w:spacing w:line="240" w:lineRule="auto"/>
+              <w:ind w:firstLine="0"/>
+              <w:jc w:val="center"/>
+              <w:rPr>
+                <w:rFonts w:eastAsia="Times New Roman"/>
+                <w:b/>
+                <w:bCs/>
+                <w:color w:val="FFFFFF" w:themeColor="background1"/>
+                <w:lang w:eastAsia="en-US"/>
+              </w:rPr>
+            </w:pPr>
+            <w:r>
+              <w:rPr>
+                <w:rFonts w:eastAsia="Times New Roman"/>
+                <w:b/>
+                <w:bCs/>
+                <w:color w:val="FFFFFF" w:themeColor="background1"/>
+                <w:lang w:eastAsia="en-US"/>
+              </w:rPr>
+              <w:t>COMPOSIÇÃO DO BDI ADOTADO NO ORÇAMENTO</w:t>
+            </w:r>
+          </w:p>
+          <w:p>
+            <w:pPr>
+              <w:spacing w:line="240" w:lineRule="auto"/>
+              <w:ind w:firstLine="0"/>
+              <w:jc w:val="center"/>
+              <w:rPr>
+                <w:rFonts w:eastAsia="Times New Roman"/>
+                <w:b/>
+                <w:bCs/>
+                <w:color w:val="FFFFFF" w:themeColor="background1"/>
+                <w:sz w:val="26"/>
+                <w:szCs w:val="26"/>
+                <w:lang w:eastAsia="en-US"/>
+              </w:rPr>
+            </w:pPr>
+            <w:r>
+              <w:rPr>
+                <w:rFonts w:eastAsia="Times New Roman"/>
+                <w:b/>
+                <w:bCs/>
+                <w:color w:val="FFFFFF" w:themeColor="background1"/>
+                <w:lang w:eastAsia="en-US"/>
+              </w:rPr>
+              <w:t>OBRA DE EDIFICAÇÕES - REFORMA COM AMPLIAÇÃO DE ATÉ 40%</w:t>
+            </w:r>
+          </w:p>
+        </w:tc>
+      </w:tr>
+      <w:tr>
+        <w:trPr>
+          <w:trHeight w:val="335"/>
+          <w:jc w:val="center"/>
+        </w:trPr>
+        <w:tc>
+          <w:tcPr>
+            <w:tcW w:w="9923" w:type="dxa"/>
+            <w:gridSpan w:val="2"/>
+            <w:tcBorders>
+              <w:top w:val="single" w:sz="8" w:space="0" w:color="auto"/>
+              <w:left w:val="single" w:sz="8" w:space="0" w:color="auto"/>
+              <w:bottom w:val="nil"/>
+              <w:right w:val="single" w:sz="8" w:space="0" w:color="000000"/>
+            </w:tcBorders>
+            <w:shd w:val="clear" w:color="auto" w:fill="D9D9D9" w:themeFill="background1" w:themeFillShade="D9"/>
+            <w:vAlign w:val="center"/>
+            <w:hideMark/>
+          </w:tcPr>
+          <w:p>
+            <w:pPr>
+              <w:spacing w:line="240" w:lineRule="auto"/>
+              <w:ind w:firstLine="0"/>
+              <w:jc w:val="center"/>
+              <w:rPr>
+                <w:rFonts w:eastAsia="Times New Roman"/>
+                <w:b/>
+                <w:bCs/>
+                <w:color w:val="000000"/>
+                <w:sz w:val="26"/>
+                <w:szCs w:val="26"/>
+                <w:lang w:eastAsia="en-US"/>
+              </w:rPr>
+            </w:pPr>
+            <w:r>
+              <w:rPr>
+                <w:rFonts w:eastAsia="Times New Roman"/>
+                <w:b/>
+                <w:bCs/>
+                <w:color w:val="000000"/>
+                <w:lang w:eastAsia="en-US"/>
+              </w:rPr>
+              <w:t>Elaborado pelos autores com base no Relatório do TCU-TC 025.990/2008-2, em atendimento ao Acórdão n. 1.425/2007</w:t>
+            </w:r>
+          </w:p>
+        </w:tc>
+      </w:tr>
+      <w:tr>
+        <w:trPr>
+          <w:trHeight w:val="300"/>
+          <w:jc w:val="center"/>
+        </w:trPr>
+        <w:tc>
+          <w:tcPr>
+            <w:tcW w:w="6663" w:type="dxa"/>
+            <w:tcBorders>
+              <w:top w:val="single" w:sz="8" w:space="0" w:color="auto"/>
+              <w:left w:val="single" w:sz="8" w:space="0" w:color="auto"/>
+              <w:bottom w:val="single" w:sz="4" w:space="0" w:color="auto"/>
+              <w:right w:val="single" w:sz="4" w:space="0" w:color="auto"/>
+            </w:tcBorders>
+            <w:shd w:val="clear" w:color="auto" w:fill="E2EFD9" w:themeFill="accent6" w:themeFillTint="33"/>
+            <w:noWrap/>
+            <w:vAlign w:val="center"/>
+            <w:hideMark/>
+          </w:tcPr>
+          <w:p>
+            <w:pPr>
+              <w:spacing w:line="240" w:lineRule="auto"/>
+              <w:ind w:firstLine="0"/>
+              <w:jc w:val="left"/>
+              <w:rPr>
+                <w:rFonts w:eastAsia="Times New Roman"/>
+                <w:color w:val="000000"/>
+                <w:lang w:eastAsia="en-US"/>
+              </w:rPr>
+            </w:pPr>
+            <w:r>
+              <w:rPr>
+                <w:rFonts w:eastAsia="Times New Roman"/>
+                <w:color w:val="000000"/>
+                <w:lang w:eastAsia="en-US"/>
+              </w:rPr>
+              <w:t>ADMINISTRAÇÃO CENTRAL - LUCRO</w:t>
+            </w:r>
+          </w:p>
+        </w:tc>
+        <w:tc>
+          <w:tcPr>
+            <w:tcW w:w="3260" w:type="dxa"/>
+            <w:tcBorders>
+              <w:top w:val="single" w:sz="8" w:space="0" w:color="auto"/>
+              <w:left w:val="nil"/>
+              <w:bottom w:val="single" w:sz="4" w:space="0" w:color="auto"/>
+              <w:right w:val="single" w:sz="8" w:space="0" w:color="auto"/>
+            </w:tcBorders>
+            <w:shd w:val="clear" w:color="auto" w:fill="E2EFD9" w:themeFill="accent6" w:themeFillTint="33"/>
+            <w:noWrap/>
+            <w:vAlign w:val="center"/>
+            <w:hideMark/>
+          </w:tcPr>
+          <w:p>
+            <w:pPr>
+              <w:spacing w:line="240" w:lineRule="auto"/>
+              <w:ind w:firstLine="0"/>
+              <w:jc w:val="center"/>
+              <w:rPr>
+                <w:rFonts w:eastAsia="Times New Roman"/>
+                <w:color w:val="000000"/>
+                <w:lang w:eastAsia="en-US"/>
+              </w:rPr>
+            </w:pPr>
+            <w:r>
+              <w:rPr>
+                <w:rFonts w:eastAsia="Times New Roman"/>
+                <w:color w:val="000000"/>
+                <w:lang w:eastAsia="en-US"/>
+              </w:rPr>
+              <w:t>18,90%</w:t>
+            </w:r>
+          </w:p>
+        </w:tc>
+      </w:tr>
+      <w:tr>
+        <w:trPr>
+          <w:trHeight w:val="300"/>
+          <w:jc w:val="center"/>
+        </w:trPr>
+        <w:tc>
+          <w:tcPr>
+            <w:tcW w:w="6663" w:type="dxa"/>
+            <w:tcBorders>
+              <w:top w:val="nil"/>
+              <w:left w:val="single" w:sz="8" w:space="0" w:color="auto"/>
+              <w:bottom w:val="single" w:sz="4" w:space="0" w:color="auto"/>
+              <w:right w:val="single" w:sz="4" w:space="0" w:color="auto"/>
+            </w:tcBorders>
+            <w:shd w:val="clear" w:color="auto" w:fill="E2EFD9" w:themeFill="accent6" w:themeFillTint="33"/>
+            <w:noWrap/>
+            <w:vAlign w:val="center"/>
+            <w:hideMark/>
+          </w:tcPr>
+          <w:p>
+            <w:pPr>
+              <w:spacing w:line="240" w:lineRule="auto"/>
+              <w:ind w:firstLine="0"/>
+              <w:jc w:val="left"/>
+              <w:rPr>
+                <w:rFonts w:eastAsia="Times New Roman"/>
+                <w:color w:val="000000"/>
+                <w:lang w:eastAsia="en-US"/>
+              </w:rPr>
+            </w:pPr>
+            <w:r>
+              <w:rPr>
+                <w:rFonts w:eastAsia="Times New Roman"/>
+                <w:color w:val="000000"/>
+                <w:lang w:eastAsia="en-US"/>
+              </w:rPr>
+              <w:t>DESPESAS FINANCEIRAS</w:t>
+            </w:r>
+          </w:p>
+        </w:tc>
+        <w:tc>
+          <w:tcPr>
+            <w:tcW w:w="3260" w:type="dxa"/>
+            <w:tcBorders>
+              <w:top w:val="nil"/>
+              <w:left w:val="nil"/>
+              <w:bottom w:val="single" w:sz="4" w:space="0" w:color="auto"/>
+              <w:right w:val="single" w:sz="8" w:space="0" w:color="auto"/>
+            </w:tcBorders>
+            <w:shd w:val="clear" w:color="auto" w:fill="E2EFD9" w:themeFill="accent6" w:themeFillTint="33"/>
+            <w:noWrap/>
+            <w:vAlign w:val="center"/>
+            <w:hideMark/>
+          </w:tcPr>
+          <w:p>
+            <w:pPr>
+              <w:spacing w:line="240" w:lineRule="auto"/>
+              <w:ind w:firstLine="0"/>
+              <w:jc w:val="center"/>
+              <w:rPr>
+                <w:rFonts w:eastAsia="Times New Roman"/>
+                <w:color w:val="000000"/>
+                <w:lang w:eastAsia="en-US"/>
+              </w:rPr>
+            </w:pPr>
+            <w:r>
+              <w:rPr>
+                <w:rFonts w:eastAsia="Times New Roman"/>
+                <w:color w:val="000000"/>
+                <w:lang w:eastAsia="en-US"/>
+              </w:rPr>
+              <w:t>1,50%</w:t>
+            </w:r>
+          </w:p>
+        </w:tc>
+      </w:tr>
+      <w:tr>
+        <w:trPr>
+          <w:trHeight w:val="300"/>
+          <w:jc w:val="center"/>
+        </w:trPr>
+        <w:tc>
+          <w:tcPr>
+            <w:tcW w:w="6663" w:type="dxa"/>
+            <w:tcBorders>
+              <w:top w:val="nil"/>
+              <w:left w:val="single" w:sz="8" w:space="0" w:color="auto"/>
+              <w:bottom w:val="single" w:sz="4" w:space="0" w:color="auto"/>
+              <w:right w:val="single" w:sz="4" w:space="0" w:color="auto"/>
+            </w:tcBorders>
+            <w:shd w:val="clear" w:color="auto" w:fill="E2EFD9" w:themeFill="accent6" w:themeFillTint="33"/>
+            <w:noWrap/>
+            <w:vAlign w:val="center"/>
+            <w:hideMark/>
+          </w:tcPr>
+          <w:p>
+            <w:pPr>
+              <w:spacing w:line="240" w:lineRule="auto"/>
+              <w:ind w:firstLine="0"/>
+              <w:jc w:val="left"/>
+              <w:rPr>
+                <w:rFonts w:eastAsia="Times New Roman"/>
+                <w:color w:val="000000"/>
+                <w:lang w:eastAsia="en-US"/>
+              </w:rPr>
+            </w:pPr>
+            <w:r>
+              <w:rPr>
+                <w:rFonts w:eastAsia="Times New Roman"/>
+                <w:color w:val="000000"/>
+                <w:lang w:eastAsia="en-US"/>
+              </w:rPr>
+              <w:t>SEGUROS, RISCOS E GARANTIAS</w:t>
+            </w:r>
+          </w:p>
+        </w:tc>
+        <w:tc>
+          <w:tcPr>
+            <w:tcW w:w="3260" w:type="dxa"/>
+            <w:tcBorders>
+              <w:top w:val="nil"/>
+              <w:left w:val="nil"/>
+              <w:bottom w:val="single" w:sz="4" w:space="0" w:color="auto"/>
+              <w:right w:val="single" w:sz="8" w:space="0" w:color="auto"/>
+            </w:tcBorders>
+            <w:shd w:val="clear" w:color="auto" w:fill="E2EFD9" w:themeFill="accent6" w:themeFillTint="33"/>
+            <w:noWrap/>
+            <w:vAlign w:val="center"/>
+            <w:hideMark/>
+          </w:tcPr>
+          <w:p>
+            <w:pPr>
+              <w:spacing w:line="240" w:lineRule="auto"/>
+              <w:ind w:firstLine="0"/>
+              <w:jc w:val="center"/>
+              <w:rPr>
+                <w:rFonts w:eastAsia="Times New Roman"/>
+                <w:color w:val="000000"/>
+                <w:lang w:eastAsia="en-US"/>
+              </w:rPr>
+            </w:pPr>
+            <w:r>
+              <w:rPr>
+                <w:rFonts w:eastAsia="Times New Roman"/>
+                <w:color w:val="000000"/>
+                <w:lang w:eastAsia="en-US"/>
+              </w:rPr>
+              <w:t>3,57%</w:t>
+            </w:r>
+          </w:p>
+        </w:tc>
+      </w:tr>
+      <w:tr>
+        <w:trPr>
+          <w:trHeight w:val="315"/>
+          <w:jc w:val="center"/>
+        </w:trPr>
+        <w:tc>
+          <w:tcPr>
+            <w:tcW w:w="6663" w:type="dxa"/>
+            <w:tcBorders>
+              <w:top w:val="nil"/>
+              <w:left w:val="single" w:sz="8" w:space="0" w:color="auto"/>
+              <w:bottom w:val="single" w:sz="8" w:space="0" w:color="auto"/>
+              <w:right w:val="single" w:sz="4" w:space="0" w:color="auto"/>
+            </w:tcBorders>
+            <w:shd w:val="clear" w:color="auto" w:fill="E2EFD9" w:themeFill="accent6" w:themeFillTint="33"/>
+            <w:noWrap/>
+            <w:vAlign w:val="center"/>
+            <w:hideMark/>
+          </w:tcPr>
+          <w:p>
+            <w:pPr>
+              <w:spacing w:line="240" w:lineRule="auto"/>
+              <w:ind w:firstLine="0"/>
+              <w:jc w:val="left"/>
+              <w:rPr>
+                <w:rFonts w:eastAsia="Times New Roman"/>
+                <w:color w:val="000000"/>
+                <w:lang w:eastAsia="en-US"/>
+              </w:rPr>
+            </w:pPr>
+            <w:r>
+              <w:rPr>
+                <w:rFonts w:eastAsia="Times New Roman"/>
+                <w:color w:val="000000"/>
+                <w:lang w:eastAsia="en-US"/>
+              </w:rPr>
+              <w:t>TRIBUTOS</w:t>
+            </w:r>
+          </w:p>
+        </w:tc>
+        <w:tc>
+          <w:tcPr>
+            <w:tcW w:w="3260" w:type="dxa"/>
+            <w:tcBorders>
+              <w:top w:val="nil"/>
+              <w:left w:val="nil"/>
+              <w:bottom w:val="single" w:sz="8" w:space="0" w:color="auto"/>
+              <w:right w:val="single" w:sz="8" w:space="0" w:color="auto"/>
+            </w:tcBorders>
+            <w:shd w:val="clear" w:color="auto" w:fill="E2EFD9" w:themeFill="accent6" w:themeFillTint="33"/>
+            <w:noWrap/>
+            <w:vAlign w:val="center"/>
+            <w:hideMark/>
+          </w:tcPr>
+          <w:p>
+            <w:pPr>
+              <w:spacing w:line="240" w:lineRule="auto"/>
+              <w:ind w:firstLine="0"/>
+              <w:jc w:val="center"/>
+              <w:rPr>
+                <w:rFonts w:eastAsia="Times New Roman"/>
+                <w:color w:val="000000"/>
+                <w:lang w:eastAsia="en-US"/>
+              </w:rPr>
+            </w:pPr>
+            <w:r>
+              <w:rPr>
+                <w:rFonts w:eastAsia="Times New Roman"/>
+                <w:color w:val="000000"/>
+                <w:lang w:eastAsia="en-US"/>
+              </w:rPr>
+              <w:t>6,65%</w:t>
+            </w:r>
+          </w:p>
+        </w:tc>
+      </w:tr>
+      <w:tr>
+        <w:trPr>
+          <w:trHeight w:val="390"/>
+          <w:jc w:val="center"/>
+        </w:trPr>
+        <w:tc>
+          <w:tcPr>
+            <w:tcW w:w="6663" w:type="dxa"/>
+            <w:tcBorders>
+              <w:top w:val="nil"/>
+              <w:left w:val="single" w:sz="8" w:space="0" w:color="auto"/>
+              <w:bottom w:val="single" w:sz="8" w:space="0" w:color="auto"/>
+              <w:right w:val="single" w:sz="4" w:space="0" w:color="auto"/>
+            </w:tcBorders>
+            <w:shd w:val="clear" w:color="auto" w:fill="538135" w:themeFill="accent6" w:themeFillShade="BF"/>
+            <w:noWrap/>
+            <w:vAlign w:val="center"/>
+            <w:hideMark/>
+          </w:tcPr>
+          <w:p>
+            <w:pPr>
+              <w:spacing w:line="240" w:lineRule="auto"/>
+              <w:ind w:firstLine="0"/>
+              <w:jc w:val="center"/>
+              <w:rPr>
+                <w:rFonts w:eastAsia="Times New Roman"/>
+                <w:b/>
+                <w:bCs/>
+                <w:color w:val="FFFFFF" w:themeColor="background1"/>
+                <w:sz w:val="26"/>
+                <w:szCs w:val="26"/>
+                <w:lang w:eastAsia="en-US"/>
+              </w:rPr>
+            </w:pPr>
+            <w:r>
+              <w:rPr>
+                <w:rFonts w:eastAsia="Times New Roman"/>
+                <w:b/>
+                <w:bCs/>
+                <w:color w:val="FFFFFF" w:themeColor="background1"/>
+                <w:sz w:val="26"/>
+                <w:szCs w:val="26"/>
+                <w:lang w:eastAsia="en-US"/>
+              </w:rPr>
+              <w:t>T</w:t>
+            </w:r>
+            <w:r>
+              <w:rPr>
+                <w:rFonts w:eastAsia="Times New Roman"/>
+                <w:b/>
+                <w:bCs/>
+                <w:color w:val="FFFFFF" w:themeColor="background1"/>
+                <w:sz w:val="26"/>
+                <w:szCs w:val="26"/>
+                <w:lang w:eastAsia="en-US"/>
+              </w:rPr>
+              <w:t xml:space="preserve">otal do </w:t>
+            </w:r>
+            <w:r>
+              <w:rPr>
+                <w:rFonts w:eastAsia="Times New Roman"/>
+                <w:b/>
+                <w:bCs/>
+                <w:color w:val="FFFFFF" w:themeColor="background1"/>
+                <w:sz w:val="26"/>
+                <w:szCs w:val="26"/>
+                <w:lang w:eastAsia="en-US"/>
+              </w:rPr>
+              <w:t xml:space="preserve">BDI </w:t>
+            </w:r>
+            <w:r>
+              <w:rPr>
+                <w:rFonts w:eastAsia="Times New Roman"/>
+                <w:b/>
+                <w:bCs/>
+                <w:color w:val="FFFFFF" w:themeColor="background1"/>
+                <w:sz w:val="26"/>
+                <w:szCs w:val="26"/>
+                <w:lang w:eastAsia="en-US"/>
+              </w:rPr>
+              <w:t>-</w:t>
+            </w:r>
+            <w:r>
+              <w:rPr>
+                <w:rFonts w:eastAsia="Times New Roman"/>
+                <w:b/>
+                <w:bCs/>
+                <w:color w:val="FFFFFF" w:themeColor="background1"/>
+                <w:sz w:val="26"/>
+                <w:szCs w:val="26"/>
+                <w:lang w:eastAsia="en-US"/>
+              </w:rPr>
+              <w:t xml:space="preserve"> B</w:t>
+            </w:r>
+            <w:r>
+              <w:rPr>
+                <w:rFonts w:eastAsia="Times New Roman"/>
+                <w:b/>
+                <w:bCs/>
+                <w:color w:val="FFFFFF" w:themeColor="background1"/>
+                <w:sz w:val="26"/>
+                <w:szCs w:val="26"/>
+                <w:lang w:eastAsia="en-US"/>
+              </w:rPr>
+              <w:t>enefícios e despesas indiretas</w:t>
+            </w:r>
+          </w:p>
+        </w:tc>
+        <w:tc>
+          <w:tcPr>
+            <w:tcW w:w="3260" w:type="dxa"/>
+            <w:tcBorders>
+              <w:top w:val="nil"/>
+              <w:left w:val="nil"/>
+              <w:bottom w:val="single" w:sz="8" w:space="0" w:color="auto"/>
+              <w:right w:val="single" w:sz="8" w:space="0" w:color="auto"/>
+            </w:tcBorders>
+            <w:shd w:val="clear" w:color="auto" w:fill="538135" w:themeFill="accent6" w:themeFillShade="BF"/>
+            <w:noWrap/>
+            <w:vAlign w:val="center"/>
+            <w:hideMark/>
+          </w:tcPr>
+          <w:p>
+            <w:pPr>
+              <w:spacing w:line="240" w:lineRule="auto"/>
+              <w:ind w:firstLine="0"/>
+              <w:jc w:val="center"/>
+              <w:rPr>
+                <w:rFonts w:eastAsia="Times New Roman"/>
+                <w:b/>
+                <w:bCs/>
+                <w:color w:val="FFFFFF" w:themeColor="background1"/>
+                <w:sz w:val="26"/>
+                <w:szCs w:val="26"/>
+                <w:lang w:eastAsia="en-US"/>
+              </w:rPr>
+            </w:pPr>
+            <w:r>
+              <w:rPr>
+                <w:rFonts w:eastAsia="Times New Roman"/>
+                <w:b/>
+                <w:bCs/>
+                <w:color w:val="FFFFFF" w:themeColor="background1"/>
+                <w:sz w:val="26"/>
+                <w:szCs w:val="26"/>
+                <w:lang w:eastAsia="en-US"/>
+              </w:rPr>
+              <w:t>30,62%</w:t>
+            </w:r>
+          </w:p>
+        </w:tc>
+      </w:tr>
+    </w:tbl>
+    <w:p>
+      <w:pPr>
+        <w:rPr>
+          <w:szCs w:val="26"/>
+        </w:rPr>
+      </w:pPr>
+      <w:r>
+        <w:br w:type="page"/>
+      </w:r>
+    </w:p>
+    <w:p>
+      <w:pPr>
         <w:pStyle w:val="Ttulo1"/>
       </w:pPr>
-      <w:bookmarkStart w:id="2" w:name="_Toc160195270"/>
+      <w:bookmarkStart w:id="3" w:name="_Toc160195270"/>
       <w:bookmarkEnd w:id="1"/>
       <w:r>
         <w:lastRenderedPageBreak/>
         <w:t>CONCLUSÃO</w:t>
       </w:r>
-      <w:bookmarkEnd w:id="2"/>
+      <w:bookmarkEnd w:id="3"/>
       <w:r>
         <w:t xml:space="preserve"> E ENCERRAMENTO</w:t>
       </w:r>
@@ -27218,7 +27959,7 @@
         <w:spacing w:line="276" w:lineRule="auto"/>
         <w:ind w:left="708" w:firstLine="0"/>
       </w:pPr>
-      <w:bookmarkStart w:id="3" w:name="_Hlk156376036"/>
+      <w:bookmarkStart w:id="4" w:name="_Hlk156376036"/>
     </w:p>
     <w:tbl>
       <w:tblPr>
@@ -27490,7 +28231,7 @@
           <w:smallCaps/>
           <w:noProof/>
         </w:rPr>
-        <w:t>18 de junho de 2026</w:t>
+        <w:t>14 de agosto de 2026</w:t>
       </w:r>
       <w:r>
         <w:rPr>
@@ -27606,7 +28347,7 @@
           </wp:inline>
         </w:drawing>
       </w:r>
-      <w:bookmarkEnd w:id="3"/>
+      <w:bookmarkEnd w:id="4"/>
     </w:p>
     <w:sectPr>
       <w:footerReference w:type="default" r:id="rId10"/>
@@ -27623,7 +28364,7 @@
 </file>
 
 <file path=word/endnotes.xml><?xml version="1.0" encoding="utf-8"?>
-<w:endnotes xmlns:wpc="http://schemas.microsoft.com/office/word/2010/wordprocessingCanvas" xmlns:cx="http://schemas.microsoft.com/office/drawing/2014/chartex" xmlns:cx1="http://schemas.microsoft.com/office/drawing/2015/9/8/chartex" xmlns:cx2="http://schemas.microsoft.com/office/drawing/2015/10/21/chartex" xmlns:cx3="http://schemas.microsoft.com/office/drawing/2016/5/9/chartex" xmlns:cx4="http://schemas.microsoft.com/office/drawing/2016/5/10/chartex" xmlns:cx5="http://schemas.microsoft.com/office/drawing/2016/5/11/chartex" xmlns:cx6="http://schemas.microsoft.com/office/drawing/2016/5/12/chartex" xmlns:cx7="http://schemas.microsoft.com/office/drawing/2016/5/13/chartex" xmlns:cx8="http://schemas.microsoft.com/office/drawing/2016/5/14/chartex" xmlns:mc="http://schemas.openxmlformats.org/markup-compatibility/2006" xmlns:aink="http://schemas.microsoft.com/office/drawing/2016/ink" xmlns:am3d="http://schemas.microsoft.com/office/drawing/2017/model3d" xmlns:o="urn:schemas-microsoft-com:office:office" xmlns:oel="http://schemas.microsoft.com/office/2019/extlst" xmlns:r="http://schemas.openxmlformats.org/officeDocument/2006/relationships" xmlns:m="http://schemas.openxmlformats.org/officeDocument/2006/math" xmlns:v="urn:schemas-microsoft-com:vml" xmlns:wp14="http://schemas.microsoft.com/office/word/2010/wordprocessingDrawing" xmlns:wp="http://schemas.openxmlformats.org/drawingml/2006/wordprocessingDrawing" xmlns:w10="urn:schemas-microsoft-com:office:word" xmlns:w="http://schemas.openxmlformats.org/wordprocessingml/2006/main" xmlns:w14="http://schemas.microsoft.com/office/word/2010/wordml" xmlns:w15="http://schemas.microsoft.com/office/word/2012/wordml" xmlns:w16cex="http://schemas.microsoft.com/office/word/2018/wordml/cex" xmlns:w16cid="http://schemas.microsoft.com/office/word/2016/wordml/cid" xmlns:w16="http://schemas.microsoft.com/office/word/2018/wordml" xmlns:w16du="http://schemas.microsoft.com/office/word/2023/wordml/word16du" xmlns:w16sdtdh="http://schemas.microsoft.com/office/word/2020/wordml/sdtdatahash" xmlns:w16sdtfl="http://schemas.microsoft.com/office/word/2024/wordml/sdtformatlock" xmlns:w16se="http://schemas.microsoft.com/office/word/2015/wordml/symex" xmlns:wpg="http://schemas.microsoft.com/office/word/2010/wordprocessingGroup" xmlns:wpi="http://schemas.microsoft.com/office/word/2010/wordprocessingInk" xmlns:wne="http://schemas.microsoft.com/office/word/2006/wordml" xmlns:wps="http://schemas.microsoft.com/office/word/2010/wordprocessingShape" mc:Ignorable="w14 w15 w16se w16cid w16 w16cex w16sdtdh w16sdtfl w16du wp14">
+<w:endnotes xmlns:wpc="http://schemas.microsoft.com/office/word/2010/wordprocessingCanvas" xmlns:cx="http://schemas.microsoft.com/office/drawing/2014/chartex" xmlns:cx1="http://schemas.microsoft.com/office/drawing/2015/9/8/chartex" xmlns:cx2="http://schemas.microsoft.com/office/drawing/2015/10/21/chartex" xmlns:cx3="http://schemas.microsoft.com/office/drawing/2016/5/9/chartex" xmlns:cx4="http://schemas.microsoft.com/office/drawing/2016/5/10/chartex" xmlns:cx5="http://schemas.microsoft.com/office/drawing/2016/5/11/chartex" xmlns:cx6="http://schemas.microsoft.com/office/drawing/2016/5/12/chartex" xmlns:cx7="http://schemas.microsoft.com/office/drawing/2016/5/13/chartex" xmlns:cx8="http://schemas.microsoft.com/office/drawing/2016/5/14/chartex" xmlns:mc="http://schemas.openxmlformats.org/markup-compatibility/2006" xmlns:aink="http://schemas.microsoft.com/office/drawing/2016/ink" xmlns:am3d="http://schemas.microsoft.com/office/drawing/2017/model3d" xmlns:o="urn:schemas-microsoft-com:office:office" xmlns:oel="http://schemas.microsoft.com/office/2019/extlst" xmlns:r="http://schemas.openxmlformats.org/officeDocument/2006/relationships" xmlns:m="http://schemas.openxmlformats.org/officeDocument/2006/math" xmlns:v="urn:schemas-microsoft-com:vml" xmlns:wp14="http://schemas.microsoft.com/office/word/2010/wordprocessingDrawing" xmlns:wp="http://schemas.openxmlformats.org/drawingml/2006/wordprocessingDrawing" xmlns:w10="urn:schemas-microsoft-com:office:word" xmlns:w="http://schemas.openxmlformats.org/wordprocessingml/2006/main" xmlns:w14="http://schemas.microsoft.com/office/word/2010/wordml" xmlns:w15="http://schemas.microsoft.com/office/word/2012/wordml" xmlns:w16cei="http://schemas.microsoft.com/office/word/2026/wordml/cei" xmlns:w16cex="http://schemas.microsoft.com/office/word/2018/wordml/cex" xmlns:w16cid="http://schemas.microsoft.com/office/word/2016/wordml/cid" xmlns:w16="http://schemas.microsoft.com/office/word/2018/wordml" xmlns:w16du="http://schemas.microsoft.com/office/word/2023/wordml/word16du" xmlns:w16sdtdh="http://schemas.microsoft.com/office/word/2020/wordml/sdtdatahash" xmlns:w16sdtfl="http://schemas.microsoft.com/office/word/2024/wordml/sdtformatlock" xmlns:w16se="http://schemas.microsoft.com/office/word/2015/wordml/symex" xmlns:wpg="http://schemas.microsoft.com/office/word/2010/wordprocessingGroup" xmlns:wpi="http://schemas.microsoft.com/office/word/2010/wordprocessingInk" xmlns:wne="http://schemas.microsoft.com/office/word/2006/wordml" xmlns:wps="http://schemas.microsoft.com/office/word/2010/wordprocessingShape" mc:Ignorable="w14 w15 w16se w16cid w16 w16cex w16sdtdh w16sdtfl w16du wp14">
   <w:endnote w:type="separator" w:id="-1">
     <w:p>
       <w:pPr>
@@ -27648,7 +28389,7 @@
 </file>
 
 <file path=word/footer1.xml><?xml version="1.0" encoding="utf-8"?>
-<w:ftr xmlns:wpc="http://schemas.microsoft.com/office/word/2010/wordprocessingCanvas" xmlns:cx="http://schemas.microsoft.com/office/drawing/2014/chartex" xmlns:cx1="http://schemas.microsoft.com/office/drawing/2015/9/8/chartex" xmlns:cx2="http://schemas.microsoft.com/office/drawing/2015/10/21/chartex" xmlns:cx3="http://schemas.microsoft.com/office/drawing/2016/5/9/chartex" xmlns:cx4="http://schemas.microsoft.com/office/drawing/2016/5/10/chartex" xmlns:cx5="http://schemas.microsoft.com/office/drawing/2016/5/11/chartex" xmlns:cx6="http://schemas.microsoft.com/office/drawing/2016/5/12/chartex" xmlns:cx7="http://schemas.microsoft.com/office/drawing/2016/5/13/chartex" xmlns:cx8="http://schemas.microsoft.com/office/drawing/2016/5/14/chartex" xmlns:mc="http://schemas.openxmlformats.org/markup-compatibility/2006" xmlns:aink="http://schemas.microsoft.com/office/drawing/2016/ink" xmlns:am3d="http://schemas.microsoft.com/office/drawing/2017/model3d" xmlns:o="urn:schemas-microsoft-com:office:office" xmlns:oel="http://schemas.microsoft.com/office/2019/extlst" xmlns:r="http://schemas.openxmlformats.org/officeDocument/2006/relationships" xmlns:m="http://schemas.openxmlformats.org/officeDocument/2006/math" xmlns:v="urn:schemas-microsoft-com:vml" xmlns:wp14="http://schemas.microsoft.com/office/word/2010/wordprocessingDrawing" xmlns:wp="http://schemas.openxmlformats.org/drawingml/2006/wordprocessingDrawing" xmlns:w10="urn:schemas-microsoft-com:office:word" xmlns:w="http://schemas.openxmlformats.org/wordprocessingml/2006/main" xmlns:w14="http://schemas.microsoft.com/office/word/2010/wordml" xmlns:w15="http://schemas.microsoft.com/office/word/2012/wordml" xmlns:w16cex="http://schemas.microsoft.com/office/word/2018/wordml/cex" xmlns:w16cid="http://schemas.microsoft.com/office/word/2016/wordml/cid" xmlns:w16="http://schemas.microsoft.com/office/word/2018/wordml" xmlns:w16du="http://schemas.microsoft.com/office/word/2023/wordml/word16du" xmlns:w16sdtdh="http://schemas.microsoft.com/office/word/2020/wordml/sdtdatahash" xmlns:w16sdtfl="http://schemas.microsoft.com/office/word/2024/wordml/sdtformatlock" xmlns:w16se="http://schemas.microsoft.com/office/word/2015/wordml/symex" xmlns:wpg="http://schemas.microsoft.com/office/word/2010/wordprocessingGroup" xmlns:wpi="http://schemas.microsoft.com/office/word/2010/wordprocessingInk" xmlns:wne="http://schemas.microsoft.com/office/word/2006/wordml" xmlns:wps="http://schemas.microsoft.com/office/word/2010/wordprocessingShape" mc:Ignorable="w14 w15 w16se w16cid w16 w16cex w16sdtdh w16sdtfl w16du wp14">
+<w:ftr xmlns:wpc="http://schemas.microsoft.com/office/word/2010/wordprocessingCanvas" xmlns:cx="http://schemas.microsoft.com/office/drawing/2014/chartex" xmlns:cx1="http://schemas.microsoft.com/office/drawing/2015/9/8/chartex" xmlns:cx2="http://schemas.microsoft.com/office/drawing/2015/10/21/chartex" xmlns:cx3="http://schemas.microsoft.com/office/drawing/2016/5/9/chartex" xmlns:cx4="http://schemas.microsoft.com/office/drawing/2016/5/10/chartex" xmlns:cx5="http://schemas.microsoft.com/office/drawing/2016/5/11/chartex" xmlns:cx6="http://schemas.microsoft.com/office/drawing/2016/5/12/chartex" xmlns:cx7="http://schemas.microsoft.com/office/drawing/2016/5/13/chartex" xmlns:cx8="http://schemas.microsoft.com/office/drawing/2016/5/14/chartex" xmlns:mc="http://schemas.openxmlformats.org/markup-compatibility/2006" xmlns:aink="http://schemas.microsoft.com/office/drawing/2016/ink" xmlns:am3d="http://schemas.microsoft.com/office/drawing/2017/model3d" xmlns:o="urn:schemas-microsoft-com:office:office" xmlns:oel="http://schemas.microsoft.com/office/2019/extlst" xmlns:r="http://schemas.openxmlformats.org/officeDocument/2006/relationships" xmlns:m="http://schemas.openxmlformats.org/officeDocument/2006/math" xmlns:v="urn:schemas-microsoft-com:vml" xmlns:wp14="http://schemas.microsoft.com/office/word/2010/wordprocessingDrawing" xmlns:wp="http://schemas.openxmlformats.org/drawingml/2006/wordprocessingDrawing" xmlns:w10="urn:schemas-microsoft-com:office:word" xmlns:w="http://schemas.openxmlformats.org/wordprocessingml/2006/main" xmlns:w14="http://schemas.microsoft.com/office/word/2010/wordml" xmlns:w15="http://schemas.microsoft.com/office/word/2012/wordml" xmlns:w16cei="http://schemas.microsoft.com/office/word/2026/wordml/cei" xmlns:w16cex="http://schemas.microsoft.com/office/word/2018/wordml/cex" xmlns:w16cid="http://schemas.microsoft.com/office/word/2016/wordml/cid" xmlns:w16="http://schemas.microsoft.com/office/word/2018/wordml" xmlns:w16du="http://schemas.microsoft.com/office/word/2023/wordml/word16du" xmlns:w16sdtdh="http://schemas.microsoft.com/office/word/2020/wordml/sdtdatahash" xmlns:w16sdtfl="http://schemas.microsoft.com/office/word/2024/wordml/sdtformatlock" xmlns:w16se="http://schemas.microsoft.com/office/word/2015/wordml/symex" xmlns:wpg="http://schemas.microsoft.com/office/word/2010/wordprocessingGroup" xmlns:wpi="http://schemas.microsoft.com/office/word/2010/wordprocessingInk" xmlns:wne="http://schemas.microsoft.com/office/word/2006/wordml" xmlns:wps="http://schemas.microsoft.com/office/word/2010/wordprocessingShape" mc:Ignorable="w14 w15 w16se w16cid w16 w16cex w16sdtdh w16sdtfl w16du wp14">
   <w:p>
     <w:pPr>
       <w:pBdr>
@@ -27717,7 +28458,7 @@
 </file>
 
 <file path=word/footer2.xml><?xml version="1.0" encoding="utf-8"?>
-<w:ftr xmlns:wpc="http://schemas.microsoft.com/office/word/2010/wordprocessingCanvas" xmlns:cx="http://schemas.microsoft.com/office/drawing/2014/chartex" xmlns:cx1="http://schemas.microsoft.com/office/drawing/2015/9/8/chartex" xmlns:cx2="http://schemas.microsoft.com/office/drawing/2015/10/21/chartex" xmlns:cx3="http://schemas.microsoft.com/office/drawing/2016/5/9/chartex" xmlns:cx4="http://schemas.microsoft.com/office/drawing/2016/5/10/chartex" xmlns:cx5="http://schemas.microsoft.com/office/drawing/2016/5/11/chartex" xmlns:cx6="http://schemas.microsoft.com/office/drawing/2016/5/12/chartex" xmlns:cx7="http://schemas.microsoft.com/office/drawing/2016/5/13/chartex" xmlns:cx8="http://schemas.microsoft.com/office/drawing/2016/5/14/chartex" xmlns:mc="http://schemas.openxmlformats.org/markup-compatibility/2006" xmlns:aink="http://schemas.microsoft.com/office/drawing/2016/ink" xmlns:am3d="http://schemas.microsoft.com/office/drawing/2017/model3d" xmlns:o="urn:schemas-microsoft-com:office:office" xmlns:oel="http://schemas.microsoft.com/office/2019/extlst" xmlns:r="http://schemas.openxmlformats.org/officeDocument/2006/relationships" xmlns:m="http://schemas.openxmlformats.org/officeDocument/2006/math" xmlns:v="urn:schemas-microsoft-com:vml" xmlns:wp14="http://schemas.microsoft.com/office/word/2010/wordprocessingDrawing" xmlns:wp="http://schemas.openxmlformats.org/drawingml/2006/wordprocessingDrawing" xmlns:w10="urn:schemas-microsoft-com:office:word" xmlns:w="http://schemas.openxmlformats.org/wordprocessingml/2006/main" xmlns:w14="http://schemas.microsoft.com/office/word/2010/wordml" xmlns:w15="http://schemas.microsoft.com/office/word/2012/wordml" xmlns:w16cex="http://schemas.microsoft.com/office/word/2018/wordml/cex" xmlns:w16cid="http://schemas.microsoft.com/office/word/2016/wordml/cid" xmlns:w16="http://schemas.microsoft.com/office/word/2018/wordml" xmlns:w16du="http://schemas.microsoft.com/office/word/2023/wordml/word16du" xmlns:w16sdtdh="http://schemas.microsoft.com/office/word/2020/wordml/sdtdatahash" xmlns:w16sdtfl="http://schemas.microsoft.com/office/word/2024/wordml/sdtformatlock" xmlns:w16se="http://schemas.microsoft.com/office/word/2015/wordml/symex" xmlns:wpg="http://schemas.microsoft.com/office/word/2010/wordprocessingGroup" xmlns:wpi="http://schemas.microsoft.com/office/word/2010/wordprocessingInk" xmlns:wne="http://schemas.microsoft.com/office/word/2006/wordml" xmlns:wps="http://schemas.microsoft.com/office/word/2010/wordprocessingShape" mc:Ignorable="w14 w15 w16se w16cid w16 w16cex w16sdtdh w16sdtfl w16du wp14">
+<w:ftr xmlns:wpc="http://schemas.microsoft.com/office/word/2010/wordprocessingCanvas" xmlns:cx="http://schemas.microsoft.com/office/drawing/2014/chartex" xmlns:cx1="http://schemas.microsoft.com/office/drawing/2015/9/8/chartex" xmlns:cx2="http://schemas.microsoft.com/office/drawing/2015/10/21/chartex" xmlns:cx3="http://schemas.microsoft.com/office/drawing/2016/5/9/chartex" xmlns:cx4="http://schemas.microsoft.com/office/drawing/2016/5/10/chartex" xmlns:cx5="http://schemas.microsoft.com/office/drawing/2016/5/11/chartex" xmlns:cx6="http://schemas.microsoft.com/office/drawing/2016/5/12/chartex" xmlns:cx7="http://schemas.microsoft.com/office/drawing/2016/5/13/chartex" xmlns:cx8="http://schemas.microsoft.com/office/drawing/2016/5/14/chartex" xmlns:mc="http://schemas.openxmlformats.org/markup-compatibility/2006" xmlns:aink="http://schemas.microsoft.com/office/drawing/2016/ink" xmlns:am3d="http://schemas.microsoft.com/office/drawing/2017/model3d" xmlns:o="urn:schemas-microsoft-com:office:office" xmlns:oel="http://schemas.microsoft.com/office/2019/extlst" xmlns:r="http://schemas.openxmlformats.org/officeDocument/2006/relationships" xmlns:m="http://schemas.openxmlformats.org/officeDocument/2006/math" xmlns:v="urn:schemas-microsoft-com:vml" xmlns:wp14="http://schemas.microsoft.com/office/word/2010/wordprocessingDrawing" xmlns:wp="http://schemas.openxmlformats.org/drawingml/2006/wordprocessingDrawing" xmlns:w10="urn:schemas-microsoft-com:office:word" xmlns:w="http://schemas.openxmlformats.org/wordprocessingml/2006/main" xmlns:w14="http://schemas.microsoft.com/office/word/2010/wordml" xmlns:w15="http://schemas.microsoft.com/office/word/2012/wordml" xmlns:w16cei="http://schemas.microsoft.com/office/word/2026/wordml/cei" xmlns:w16cex="http://schemas.microsoft.com/office/word/2018/wordml/cex" xmlns:w16cid="http://schemas.microsoft.com/office/word/2016/wordml/cid" xmlns:w16="http://schemas.microsoft.com/office/word/2018/wordml" xmlns:w16du="http://schemas.microsoft.com/office/word/2023/wordml/word16du" xmlns:w16sdtdh="http://schemas.microsoft.com/office/word/2020/wordml/sdtdatahash" xmlns:w16sdtfl="http://schemas.microsoft.com/office/word/2024/wordml/sdtformatlock" xmlns:w16se="http://schemas.microsoft.com/office/word/2015/wordml/symex" xmlns:wpg="http://schemas.microsoft.com/office/word/2010/wordprocessingGroup" xmlns:wpi="http://schemas.microsoft.com/office/word/2010/wordprocessingInk" xmlns:wne="http://schemas.microsoft.com/office/word/2006/wordml" xmlns:wps="http://schemas.microsoft.com/office/word/2010/wordprocessingShape" mc:Ignorable="w14 w15 w16se w16cid w16 w16cex w16sdtdh w16sdtfl w16du wp14">
   <w:p>
     <w:pPr>
       <w:pBdr>
@@ -27780,7 +28521,7 @@
 </file>
 
 <file path=word/footnotes.xml><?xml version="1.0" encoding="utf-8"?>
-<w:footnotes xmlns:wpc="http://schemas.microsoft.com/office/word/2010/wordprocessingCanvas" xmlns:cx="http://schemas.microsoft.com/office/drawing/2014/chartex" xmlns:cx1="http://schemas.microsoft.com/office/drawing/2015/9/8/chartex" xmlns:cx2="http://schemas.microsoft.com/office/drawing/2015/10/21/chartex" xmlns:cx3="http://schemas.microsoft.com/office/drawing/2016/5/9/chartex" xmlns:cx4="http://schemas.microsoft.com/office/drawing/2016/5/10/chartex" xmlns:cx5="http://schemas.microsoft.com/office/drawing/2016/5/11/chartex" xmlns:cx6="http://schemas.microsoft.com/office/drawing/2016/5/12/chartex" xmlns:cx7="http://schemas.microsoft.com/office/drawing/2016/5/13/chartex" xmlns:cx8="http://schemas.microsoft.com/office/drawing/2016/5/14/chartex" xmlns:mc="http://schemas.openxmlformats.org/markup-compatibility/2006" xmlns:aink="http://schemas.microsoft.com/office/drawing/2016/ink" xmlns:am3d="http://schemas.microsoft.com/office/drawing/2017/model3d" xmlns:o="urn:schemas-microsoft-com:office:office" xmlns:oel="http://schemas.microsoft.com/office/2019/extlst" xmlns:r="http://schemas.openxmlformats.org/officeDocument/2006/relationships" xmlns:m="http://schemas.openxmlformats.org/officeDocument/2006/math" xmlns:v="urn:schemas-microsoft-com:vml" xmlns:wp14="http://schemas.microsoft.com/office/word/2010/wordprocessingDrawing" xmlns:wp="http://schemas.openxmlformats.org/drawingml/2006/wordprocessingDrawing" xmlns:w10="urn:schemas-microsoft-com:office:word" xmlns:w="http://schemas.openxmlformats.org/wordprocessingml/2006/main" xmlns:w14="http://schemas.microsoft.com/office/word/2010/wordml" xmlns:w15="http://schemas.microsoft.com/office/word/2012/wordml" xmlns:w16cex="http://schemas.microsoft.com/office/word/2018/wordml/cex" xmlns:w16cid="http://schemas.microsoft.com/office/word/2016/wordml/cid" xmlns:w16="http://schemas.microsoft.com/office/word/2018/wordml" xmlns:w16du="http://schemas.microsoft.com/office/word/2023/wordml/word16du" xmlns:w16sdtdh="http://schemas.microsoft.com/office/word/2020/wordml/sdtdatahash" xmlns:w16sdtfl="http://schemas.microsoft.com/office/word/2024/wordml/sdtformatlock" xmlns:w16se="http://schemas.microsoft.com/office/word/2015/wordml/symex" xmlns:wpg="http://schemas.microsoft.com/office/word/2010/wordprocessingGroup" xmlns:wpi="http://schemas.microsoft.com/office/word/2010/wordprocessingInk" xmlns:wne="http://schemas.microsoft.com/office/word/2006/wordml" xmlns:wps="http://schemas.microsoft.com/office/word/2010/wordprocessingShape" mc:Ignorable="w14 w15 w16se w16cid w16 w16cex w16sdtdh w16sdtfl w16du wp14">
+<w:footnotes xmlns:wpc="http://schemas.microsoft.com/office/word/2010/wordprocessingCanvas" xmlns:cx="http://schemas.microsoft.com/office/drawing/2014/chartex" xmlns:cx1="http://schemas.microsoft.com/office/drawing/2015/9/8/chartex" xmlns:cx2="http://schemas.microsoft.com/office/drawing/2015/10/21/chartex" xmlns:cx3="http://schemas.microsoft.com/office/drawing/2016/5/9/chartex" xmlns:cx4="http://schemas.microsoft.com/office/drawing/2016/5/10/chartex" xmlns:cx5="http://schemas.microsoft.com/office/drawing/2016/5/11/chartex" xmlns:cx6="http://schemas.microsoft.com/office/drawing/2016/5/12/chartex" xmlns:cx7="http://schemas.microsoft.com/office/drawing/2016/5/13/chartex" xmlns:cx8="http://schemas.microsoft.com/office/drawing/2016/5/14/chartex" xmlns:mc="http://schemas.openxmlformats.org/markup-compatibility/2006" xmlns:aink="http://schemas.microsoft.com/office/drawing/2016/ink" xmlns:am3d="http://schemas.microsoft.com/office/drawing/2017/model3d" xmlns:o="urn:schemas-microsoft-com:office:office" xmlns:oel="http://schemas.microsoft.com/office/2019/extlst" xmlns:r="http://schemas.openxmlformats.org/officeDocument/2006/relationships" xmlns:m="http://schemas.openxmlformats.org/officeDocument/2006/math" xmlns:v="urn:schemas-microsoft-com:vml" xmlns:wp14="http://schemas.microsoft.com/office/word/2010/wordprocessingDrawing" xmlns:wp="http://schemas.openxmlformats.org/drawingml/2006/wordprocessingDrawing" xmlns:w10="urn:schemas-microsoft-com:office:word" xmlns:w="http://schemas.openxmlformats.org/wordprocessingml/2006/main" xmlns:w14="http://schemas.microsoft.com/office/word/2010/wordml" xmlns:w15="http://schemas.microsoft.com/office/word/2012/wordml" xmlns:w16cei="http://schemas.microsoft.com/office/word/2026/wordml/cei" xmlns:w16cex="http://schemas.microsoft.com/office/word/2018/wordml/cex" xmlns:w16cid="http://schemas.microsoft.com/office/word/2016/wordml/cid" xmlns:w16="http://schemas.microsoft.com/office/word/2018/wordml" xmlns:w16du="http://schemas.microsoft.com/office/word/2023/wordml/word16du" xmlns:w16sdtdh="http://schemas.microsoft.com/office/word/2020/wordml/sdtdatahash" xmlns:w16sdtfl="http://schemas.microsoft.com/office/word/2024/wordml/sdtformatlock" xmlns:w16se="http://schemas.microsoft.com/office/word/2015/wordml/symex" xmlns:wpg="http://schemas.microsoft.com/office/word/2010/wordprocessingGroup" xmlns:wpi="http://schemas.microsoft.com/office/word/2010/wordprocessingInk" xmlns:wne="http://schemas.microsoft.com/office/word/2006/wordml" xmlns:wps="http://schemas.microsoft.com/office/word/2010/wordprocessingShape" mc:Ignorable="w14 w15 w16se w16cid w16 w16cex w16sdtdh w16sdtfl w16du wp14">
   <w:footnote w:type="separator" w:id="-1">
     <w:p>
       <w:pPr>
@@ -27801,18 +28542,101 @@
       </w:r>
     </w:p>
   </w:footnote>
+  <w:footnote w:id="1">
+    <w:p>
+      <w:pPr>
+        <w:pBdr>
+          <w:top w:val="nil"/>
+          <w:left w:val="nil"/>
+          <w:bottom w:val="nil"/>
+          <w:right w:val="nil"/>
+          <w:between w:val="nil"/>
+        </w:pBdr>
+        <w:ind w:firstLine="0"/>
+        <w:rPr>
+          <w:rFonts w:eastAsia="Arial"/>
+          <w:color w:val="000000"/>
+          <w:highlight w:val="white"/>
+        </w:rPr>
+      </w:pPr>
+      <w:r>
+        <w:rPr>
+          <w:rStyle w:val="Refdenotaderodap"/>
+        </w:rPr>
+        <w:footnoteRef/>
+      </w:r>
+      <w:r>
+        <w:t xml:space="preserve"> </w:t>
+      </w:r>
+      <w:r>
+        <w:rPr>
+          <w:rFonts w:eastAsia="Arial"/>
+          <w:color w:val="000000"/>
+          <w:sz w:val="14"/>
+          <w:szCs w:val="14"/>
+          <w:highlight w:val="white"/>
+        </w:rPr>
+        <w:t xml:space="preserve">TRIBUNAL DE CONTAS DA UNIÃO. </w:t>
+      </w:r>
+      <w:r>
+        <w:rPr>
+          <w:rFonts w:eastAsia="Arial"/>
+          <w:b/>
+          <w:color w:val="000000"/>
+          <w:sz w:val="14"/>
+          <w:szCs w:val="14"/>
+          <w:highlight w:val="white"/>
+        </w:rPr>
+        <w:t xml:space="preserve">BDI para obras de edificações – Reforma (Com ampliação de até 40%). </w:t>
+      </w:r>
+      <w:r>
+        <w:rPr>
+          <w:rFonts w:eastAsia="Arial"/>
+          <w:color w:val="000000"/>
+          <w:sz w:val="14"/>
+          <w:szCs w:val="14"/>
+          <w:highlight w:val="white"/>
+        </w:rPr>
+        <w:t>Disponível em: &lt;</w:t>
+      </w:r>
+      <w:r>
+        <w:rPr>
+          <w:sz w:val="14"/>
+          <w:szCs w:val="14"/>
+        </w:rPr>
+        <w:t>https://repositorio.ufsc.br/bitstream/handle/123456789/210090/Acord%C3%A3o-TCU-Abordagem-BDI%20%282%29.pdf?sequence=1&amp;isAllowed=y</w:t>
+      </w:r>
+      <w:r>
+        <w:rPr>
+          <w:rFonts w:eastAsia="Arial"/>
+          <w:color w:val="000000"/>
+          <w:sz w:val="14"/>
+          <w:szCs w:val="14"/>
+          <w:highlight w:val="white"/>
+        </w:rPr>
+        <w:t xml:space="preserve"> &gt;. </w:t>
+      </w:r>
+      <w:r>
+        <w:rPr>
+          <w:sz w:val="14"/>
+          <w:szCs w:val="14"/>
+        </w:rPr>
+        <w:t>Acesso em: 26 out. 2021.</w:t>
+      </w:r>
+    </w:p>
+  </w:footnote>
 </w:footnotes>
 </file>
 
 <file path=word/header1.xml><?xml version="1.0" encoding="utf-8"?>
-<w:hdr xmlns:wpc="http://schemas.microsoft.com/office/word/2010/wordprocessingCanvas" xmlns:cx="http://schemas.microsoft.com/office/drawing/2014/chartex" xmlns:cx1="http://schemas.microsoft.com/office/drawing/2015/9/8/chartex" xmlns:cx2="http://schemas.microsoft.com/office/drawing/2015/10/21/chartex" xmlns:cx3="http://schemas.microsoft.com/office/drawing/2016/5/9/chartex" xmlns:cx4="http://schemas.microsoft.com/office/drawing/2016/5/10/chartex" xmlns:cx5="http://schemas.microsoft.com/office/drawing/2016/5/11/chartex" xmlns:cx6="http://schemas.microsoft.com/office/drawing/2016/5/12/chartex" xmlns:cx7="http://schemas.microsoft.com/office/drawing/2016/5/13/chartex" xmlns:cx8="http://schemas.microsoft.com/office/drawing/2016/5/14/chartex" xmlns:mc="http://schemas.openxmlformats.org/markup-compatibility/2006" xmlns:aink="http://schemas.microsoft.com/office/drawing/2016/ink" xmlns:am3d="http://schemas.microsoft.com/office/drawing/2017/model3d" xmlns:o="urn:schemas-microsoft-com:office:office" xmlns:oel="http://schemas.microsoft.com/office/2019/extlst" xmlns:r="http://schemas.openxmlformats.org/officeDocument/2006/relationships" xmlns:m="http://schemas.openxmlformats.org/officeDocument/2006/math" xmlns:v="urn:schemas-microsoft-com:vml" xmlns:wp14="http://schemas.microsoft.com/office/word/2010/wordprocessingDrawing" xmlns:wp="http://schemas.openxmlformats.org/drawingml/2006/wordprocessingDrawing" xmlns:w10="urn:schemas-microsoft-com:office:word" xmlns:w="http://schemas.openxmlformats.org/wordprocessingml/2006/main" xmlns:w14="http://schemas.microsoft.com/office/word/2010/wordml" xmlns:w15="http://schemas.microsoft.com/office/word/2012/wordml" xmlns:w16cex="http://schemas.microsoft.com/office/word/2018/wordml/cex" xmlns:w16cid="http://schemas.microsoft.com/office/word/2016/wordml/cid" xmlns:w16="http://schemas.microsoft.com/office/word/2018/wordml" xmlns:w16du="http://schemas.microsoft.com/office/word/2023/wordml/word16du" xmlns:w16sdtdh="http://schemas.microsoft.com/office/word/2020/wordml/sdtdatahash" xmlns:w16sdtfl="http://schemas.microsoft.com/office/word/2024/wordml/sdtformatlock" xmlns:w16se="http://schemas.microsoft.com/office/word/2015/wordml/symex" xmlns:wpg="http://schemas.microsoft.com/office/word/2010/wordprocessingGroup" xmlns:wpi="http://schemas.microsoft.com/office/word/2010/wordprocessingInk" xmlns:wne="http://schemas.microsoft.com/office/word/2006/wordml" xmlns:wps="http://schemas.microsoft.com/office/word/2010/wordprocessingShape" mc:Ignorable="w14 w15 w16se w16cid w16 w16cex w16sdtdh w16sdtfl w16du wp14">
+<w:hdr xmlns:wpc="http://schemas.microsoft.com/office/word/2010/wordprocessingCanvas" xmlns:cx="http://schemas.microsoft.com/office/drawing/2014/chartex" xmlns:cx1="http://schemas.microsoft.com/office/drawing/2015/9/8/chartex" xmlns:cx2="http://schemas.microsoft.com/office/drawing/2015/10/21/chartex" xmlns:cx3="http://schemas.microsoft.com/office/drawing/2016/5/9/chartex" xmlns:cx4="http://schemas.microsoft.com/office/drawing/2016/5/10/chartex" xmlns:cx5="http://schemas.microsoft.com/office/drawing/2016/5/11/chartex" xmlns:cx6="http://schemas.microsoft.com/office/drawing/2016/5/12/chartex" xmlns:cx7="http://schemas.microsoft.com/office/drawing/2016/5/13/chartex" xmlns:cx8="http://schemas.microsoft.com/office/drawing/2016/5/14/chartex" xmlns:mc="http://schemas.openxmlformats.org/markup-compatibility/2006" xmlns:aink="http://schemas.microsoft.com/office/drawing/2016/ink" xmlns:am3d="http://schemas.microsoft.com/office/drawing/2017/model3d" xmlns:o="urn:schemas-microsoft-com:office:office" xmlns:oel="http://schemas.microsoft.com/office/2019/extlst" xmlns:r="http://schemas.openxmlformats.org/officeDocument/2006/relationships" xmlns:m="http://schemas.openxmlformats.org/officeDocument/2006/math" xmlns:v="urn:schemas-microsoft-com:vml" xmlns:wp14="http://schemas.microsoft.com/office/word/2010/wordprocessingDrawing" xmlns:wp="http://schemas.openxmlformats.org/drawingml/2006/wordprocessingDrawing" xmlns:w10="urn:schemas-microsoft-com:office:word" xmlns:w="http://schemas.openxmlformats.org/wordprocessingml/2006/main" xmlns:w14="http://schemas.microsoft.com/office/word/2010/wordml" xmlns:w15="http://schemas.microsoft.com/office/word/2012/wordml" xmlns:w16cei="http://schemas.microsoft.com/office/word/2026/wordml/cei" xmlns:w16cex="http://schemas.microsoft.com/office/word/2018/wordml/cex" xmlns:w16cid="http://schemas.microsoft.com/office/word/2016/wordml/cid" xmlns:w16="http://schemas.microsoft.com/office/word/2018/wordml" xmlns:w16du="http://schemas.microsoft.com/office/word/2023/wordml/word16du" xmlns:w16sdtdh="http://schemas.microsoft.com/office/word/2020/wordml/sdtdatahash" xmlns:w16sdtfl="http://schemas.microsoft.com/office/word/2024/wordml/sdtformatlock" xmlns:w16se="http://schemas.microsoft.com/office/word/2015/wordml/symex" xmlns:wpg="http://schemas.microsoft.com/office/word/2010/wordprocessingGroup" xmlns:wpi="http://schemas.microsoft.com/office/word/2010/wordprocessingInk" xmlns:wne="http://schemas.microsoft.com/office/word/2006/wordml" xmlns:wps="http://schemas.microsoft.com/office/word/2010/wordprocessingShape" mc:Ignorable="w14 w15 w16se w16cid w16 w16cex w16sdtdh w16sdtfl w16du wp14">
   <w:p/>
   <w:p/>
 </w:hdr>
 </file>
 
 <file path=word/numbering.xml><?xml version="1.0" encoding="utf-8"?>
-<w:numbering xmlns:wpc="http://schemas.microsoft.com/office/word/2010/wordprocessingCanvas" xmlns:cx="http://schemas.microsoft.com/office/drawing/2014/chartex" xmlns:cx1="http://schemas.microsoft.com/office/drawing/2015/9/8/chartex" xmlns:cx2="http://schemas.microsoft.com/office/drawing/2015/10/21/chartex" xmlns:cx3="http://schemas.microsoft.com/office/drawing/2016/5/9/chartex" xmlns:cx4="http://schemas.microsoft.com/office/drawing/2016/5/10/chartex" xmlns:cx5="http://schemas.microsoft.com/office/drawing/2016/5/11/chartex" xmlns:cx6="http://schemas.microsoft.com/office/drawing/2016/5/12/chartex" xmlns:cx7="http://schemas.microsoft.com/office/drawing/2016/5/13/chartex" xmlns:cx8="http://schemas.microsoft.com/office/drawing/2016/5/14/chartex" xmlns:mc="http://schemas.openxmlformats.org/markup-compatibility/2006" xmlns:aink="http://schemas.microsoft.com/office/drawing/2016/ink" xmlns:am3d="http://schemas.microsoft.com/office/drawing/2017/model3d" xmlns:o="urn:schemas-microsoft-com:office:office" xmlns:oel="http://schemas.microsoft.com/office/2019/extlst" xmlns:r="http://schemas.openxmlformats.org/officeDocument/2006/relationships" xmlns:m="http://schemas.openxmlformats.org/officeDocument/2006/math" xmlns:v="urn:schemas-microsoft-com:vml" xmlns:wp14="http://schemas.microsoft.com/office/word/2010/wordprocessingDrawing" xmlns:wp="http://schemas.openxmlformats.org/drawingml/2006/wordprocessingDrawing" xmlns:w10="urn:schemas-microsoft-com:office:word" xmlns:w="http://schemas.openxmlformats.org/wordprocessingml/2006/main" xmlns:w14="http://schemas.microsoft.com/office/word/2010/wordml" xmlns:w15="http://schemas.microsoft.com/office/word/2012/wordml" xmlns:w16cex="http://schemas.microsoft.com/office/word/2018/wordml/cex" xmlns:w16cid="http://schemas.microsoft.com/office/word/2016/wordml/cid" xmlns:w16="http://schemas.microsoft.com/office/word/2018/wordml" xmlns:w16du="http://schemas.microsoft.com/office/word/2023/wordml/word16du" xmlns:w16sdtdh="http://schemas.microsoft.com/office/word/2020/wordml/sdtdatahash" xmlns:w16sdtfl="http://schemas.microsoft.com/office/word/2024/wordml/sdtformatlock" xmlns:w16se="http://schemas.microsoft.com/office/word/2015/wordml/symex" xmlns:wpg="http://schemas.microsoft.com/office/word/2010/wordprocessingGroup" xmlns:wpi="http://schemas.microsoft.com/office/word/2010/wordprocessingInk" xmlns:wne="http://schemas.microsoft.com/office/word/2006/wordml" xmlns:wps="http://schemas.microsoft.com/office/word/2010/wordprocessingShape" mc:Ignorable="w14 w15 w16se w16cid w16 w16cex w16sdtdh w16sdtfl w16du wp14">
+<w:numbering xmlns:wpc="http://schemas.microsoft.com/office/word/2010/wordprocessingCanvas" xmlns:cx="http://schemas.microsoft.com/office/drawing/2014/chartex" xmlns:cx1="http://schemas.microsoft.com/office/drawing/2015/9/8/chartex" xmlns:cx2="http://schemas.microsoft.com/office/drawing/2015/10/21/chartex" xmlns:cx3="http://schemas.microsoft.com/office/drawing/2016/5/9/chartex" xmlns:cx4="http://schemas.microsoft.com/office/drawing/2016/5/10/chartex" xmlns:cx5="http://schemas.microsoft.com/office/drawing/2016/5/11/chartex" xmlns:cx6="http://schemas.microsoft.com/office/drawing/2016/5/12/chartex" xmlns:cx7="http://schemas.microsoft.com/office/drawing/2016/5/13/chartex" xmlns:cx8="http://schemas.microsoft.com/office/drawing/2016/5/14/chartex" xmlns:mc="http://schemas.openxmlformats.org/markup-compatibility/2006" xmlns:aink="http://schemas.microsoft.com/office/drawing/2016/ink" xmlns:am3d="http://schemas.microsoft.com/office/drawing/2017/model3d" xmlns:o="urn:schemas-microsoft-com:office:office" xmlns:oel="http://schemas.microsoft.com/office/2019/extlst" xmlns:r="http://schemas.openxmlformats.org/officeDocument/2006/relationships" xmlns:m="http://schemas.openxmlformats.org/officeDocument/2006/math" xmlns:v="urn:schemas-microsoft-com:vml" xmlns:wp14="http://schemas.microsoft.com/office/word/2010/wordprocessingDrawing" xmlns:wp="http://schemas.openxmlformats.org/drawingml/2006/wordprocessingDrawing" xmlns:w10="urn:schemas-microsoft-com:office:word" xmlns:w="http://schemas.openxmlformats.org/wordprocessingml/2006/main" xmlns:w14="http://schemas.microsoft.com/office/word/2010/wordml" xmlns:w15="http://schemas.microsoft.com/office/word/2012/wordml" xmlns:w16cei="http://schemas.microsoft.com/office/word/2026/wordml/cei" xmlns:w16cex="http://schemas.microsoft.com/office/word/2018/wordml/cex" xmlns:w16cid="http://schemas.microsoft.com/office/word/2016/wordml/cid" xmlns:w16="http://schemas.microsoft.com/office/word/2018/wordml" xmlns:w16du="http://schemas.microsoft.com/office/word/2023/wordml/word16du" xmlns:w16sdtdh="http://schemas.microsoft.com/office/word/2020/wordml/sdtdatahash" xmlns:w16sdtfl="http://schemas.microsoft.com/office/word/2024/wordml/sdtformatlock" xmlns:w16se="http://schemas.microsoft.com/office/word/2015/wordml/symex" xmlns:wpg="http://schemas.microsoft.com/office/word/2010/wordprocessingGroup" xmlns:wpi="http://schemas.microsoft.com/office/word/2010/wordprocessingInk" xmlns:wne="http://schemas.microsoft.com/office/word/2006/wordml" xmlns:wps="http://schemas.microsoft.com/office/word/2010/wordprocessingShape" mc:Ignorable="w14 w15 w16se w16cid w16 w16cex w16sdtdh w16sdtfl w16du wp14">
   <w:abstractNum w:abstractNumId="0" w15:restartNumberingAfterBreak="0">
     <w:nsid w:val="030468F9"/>
     <w:multiLevelType w:val="hybridMultilevel"/>
@@ -35867,28 +36691,28 @@
 </file>
 
 <file path=customXml/item1.xml><?xml version="1.0" encoding="utf-8"?>
+<b:Sources xmlns:b="http://schemas.openxmlformats.org/officeDocument/2006/bibliography" xmlns="http://schemas.openxmlformats.org/officeDocument/2006/bibliography" SelectedStyle="\APASixthEditionOfficeOnline.xsl" StyleName="APA" Version="6"/>
+</file>
+
+<file path=customXml/item2.xml><?xml version="1.0" encoding="utf-8"?>
 <go:gDocsCustomXmlDataStorage xmlns:go="http://customooxmlschemas.google.com/" xmlns:r="http://schemas.openxmlformats.org/officeDocument/2006/relationships">
   <go:docsCustomData xmlns:go="http://customooxmlschemas.google.com/" roundtripDataSignature="AMtx7mireC5jhx61ZFx9QXGA77WyrFMjeQ==">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</go:docsCustomData>
 </go:gDocsCustomXmlDataStorage>
 </file>
 
-<file path=customXml/item2.xml><?xml version="1.0" encoding="utf-8"?>
-<b:Sources xmlns:b="http://schemas.openxmlformats.org/officeDocument/2006/bibliography" xmlns="http://schemas.openxmlformats.org/officeDocument/2006/bibliography" SelectedStyle="\APASixthEditionOfficeOnline.xsl" StyleName="APA" Version="6"/>
+<file path=customXml/itemProps1.xml><?xml version="1.0" encoding="utf-8"?>
+<ds:datastoreItem xmlns:ds="http://schemas.openxmlformats.org/officeDocument/2006/customXml" ds:itemID="{A4105C5F-04F6-4385-869B-0854E47C314F}">
+  <ds:schemaRefs>
+    <ds:schemaRef ds:uri="http://schemas.openxmlformats.org/officeDocument/2006/bibliography"/>
+  </ds:schemaRefs>
+</ds:datastoreItem>
 </file>
 
-<file path=customXml/itemProps1.xml><?xml version="1.0" encoding="utf-8"?>
+<file path=customXml/itemProps2.xml><?xml version="1.0" encoding="utf-8"?>
 <ds:datastoreItem xmlns:ds="http://schemas.openxmlformats.org/officeDocument/2006/customXml" ds:itemID="{11111111-1234-1234-1234-123412341234}">
   <ds:schemaRefs>
     <ds:schemaRef ds:uri="http://customooxmlschemas.google.com/"/>
     <ds:schemaRef ds:uri="http://schemas.openxmlformats.org/officeDocument/2006/relationships"/>
   </ds:schemaRefs>
 </ds:datastoreItem>
-</file>
-
-<file path=customXml/itemProps2.xml><?xml version="1.0" encoding="utf-8"?>
-<ds:datastoreItem xmlns:ds="http://schemas.openxmlformats.org/officeDocument/2006/customXml" ds:itemID="{A4105C5F-04F6-4385-869B-0854E47C314F}">
-  <ds:schemaRefs>
-    <ds:schemaRef ds:uri="http://schemas.openxmlformats.org/officeDocument/2006/bibliography"/>
-  </ds:schemaRefs>
-</ds:datastoreItem>
 </file>
</xml_diff>